<commit_message>
feat: integrate Hunter.io email and phone discovery into LinkedIn decision maker enrichment
</commit_message>
<xml_diff>
--- a/docs/ProspectPlus_Lead_Enrichment_and_Intelligence_Guide.docx
+++ b/docs/ProspectPlus_Lead_Enrichment_and_Intelligence_Guide.docx
@@ -6754,7 +6754,7 @@
           <w:sz w:val="28"/>
           <w:szCs w:val="28"/>
         </w:rPr>
-        <w:t xml:space="preserve">4. Deep Dive: Finding Contacts from LinkedIn</w:t>
+        <w:t xml:space="preserve">4. Deep Dive: Finding Contacts from LinkedIn &amp; Hunter.io Email/Phone Waterfall</w:t>
       </w:r>
     </w:p>
     <w:p>
@@ -6766,7 +6766,7 @@
           <w:sz w:val="20"/>
           <w:szCs w:val="20"/>
         </w:rPr>
-        <w:t xml:space="preserve">Finding the right operational person is the single highest-value step in outbound B2B courier sales. The Hub completely automates this workflow:</w:t>
+        <w:t xml:space="preserve">Finding the right operational person is the single highest-value step in outbound B2B courier sales. The Hub completely automates this workflow by unifying LinkedIn profile discovery with Hunter.io email and phone waterfall enrichment:</w:t>
       </w:r>
     </w:p>
     <w:p>
@@ -6803,14 +6803,14 @@
           <w:sz w:val="20"/>
           <w:szCs w:val="20"/>
         </w:rPr>
-        <w:t xml:space="preserve">2. Primary Decision Maker Scoring: </w:t>
+        <w:t xml:space="preserve">2. Hunter.io Email &amp; Direct Phone Waterfall: </w:t>
       </w:r>
       <w:r>
         <w:rPr>
           <w:sz w:val="20"/>
           <w:szCs w:val="20"/>
         </w:rPr>
-        <w:t xml:space="preserve">The scoring algorithm flags operational budget holders with Primary Decision Maker and High Match badges, eliminating rep confusion.</w:t>
+        <w:t xml:space="preserve">Simultaneously queries Hunter.io Domain Search and Email Finder APIs using the verified domain. Matches candidates to return verified work email addresses, deliverability confidence scores (e.g. 94%), and direct phone numbers.</w:t>
       </w:r>
     </w:p>
     <w:p>
@@ -6825,14 +6825,36 @@
           <w:sz w:val="20"/>
           <w:szCs w:val="20"/>
         </w:rPr>
-        <w:t xml:space="preserve">3. 1-Click Permanent CRM Sync: </w:t>
+        <w:t xml:space="preserve">3. Primary Decision Maker Scoring: </w:t>
       </w:r>
       <w:r>
         <w:rPr>
           <w:sz w:val="20"/>
           <w:szCs w:val="20"/>
         </w:rPr>
-        <w:t xml:space="preserve">Clicking [+ Add to Contacts] immediately persists the contact into the lead's Contacts tab with full name, job title, and LinkedIn URL. The button switches to [✓ In Contacts] to prevent duplicates.</w:t>
+        <w:t xml:space="preserve">The scoring algorithm flags operational budget holders with Primary Decision Maker and High Match badges, eliminating rep confusion.</w:t>
+      </w:r>
+    </w:p>
+    <w:p>
+      <w:pPr>
+        <w:spacing w:after="60"/>
+      </w:pPr>
+      <w:r>
+        <w:rPr>
+          <w:b/>
+          <w:bCs/>
+          <w:color w:val="095C7B"/>
+          <w:sz w:val="20"/>
+          <w:szCs w:val="20"/>
+        </w:rPr>
+        <w:t xml:space="preserve">4. 1-Click Permanent CRM Sync (Zero Manual Entry): </w:t>
+      </w:r>
+      <w:r>
+        <w:rPr>
+          <w:sz w:val="20"/>
+          <w:szCs w:val="20"/>
+        </w:rPr>
+        <w:t xml:space="preserve">Clicking [+ Add to Contacts] immediately persists the contact into the lead's Contacts tab with full name, job title, LinkedIn URL, verified email, and phone number. The button switches to [✓ In Contacts] to prevent duplicates.</w:t>
       </w:r>
     </w:p>
     <w:p>
@@ -6847,7 +6869,7 @@
           <w:sz w:val="20"/>
           <w:szCs w:val="20"/>
         </w:rPr>
-        <w:t xml:space="preserve">4. Direct LinkedIn Verification: </w:t>
+        <w:t xml:space="preserve">5. Direct LinkedIn Verification: </w:t>
       </w:r>
       <w:r>
         <w:rPr>

</xml_diff>